<commit_message>
docs: finalize v3 delivery baseline and clean temp artifacts
</commit_message>
<xml_diff>
--- a/docs/paper/121052022090-吴奇鑫-软件工程-倪友聪-基于微服务架构的python端算法实验子系统.docx
+++ b/docs/paper/121052022090-吴奇鑫-软件工程-倪友聪-基于微服务架构的python端算法实验子系统.docx
@@ -25,7 +25,7 @@
           <w:sz w:val="20"/>
         </w:rPr>
         <w:drawing>
-          <wp:anchor distT="0" distB="0" distL="114300" distR="114300" simplePos="0" relativeHeight="251657216" behindDoc="0" locked="0" layoutInCell="1" allowOverlap="1" wp14:anchorId="12C69902" wp14:editId="7580B9A0">
+          <wp:anchor distT="0" distB="0" distL="114300" distR="114300" simplePos="0" relativeHeight="251657216" behindDoc="0" locked="0" layoutInCell="1" allowOverlap="1" wp14:anchorId="7CEDBCA4" wp14:editId="37758528">
             <wp:simplePos x="0" y="0"/>
             <wp:positionH relativeFrom="column">
               <wp:posOffset>2546985</wp:posOffset>
@@ -36,7 +36,7 @@
             <wp:extent cx="1143000" cy="1143000"/>
             <wp:effectExtent l="0" t="0" r="0" b="0"/>
             <wp:wrapSquare wrapText="bothSides"/>
-            <wp:docPr id="1500982695" name="Picture 19"/>
+            <wp:docPr id="1244980617" name="Picture 19"/>
             <wp:cNvGraphicFramePr>
               <a:graphicFrameLocks xmlns:a="http://schemas.openxmlformats.org/drawingml/2006/main" noChangeAspect="1"/>
             </wp:cNvGraphicFramePr>
@@ -112,7 +112,7 @@
           <w:sz w:val="20"/>
         </w:rPr>
         <w:drawing>
-          <wp:anchor distT="0" distB="0" distL="114300" distR="114300" simplePos="0" relativeHeight="251658240" behindDoc="1" locked="0" layoutInCell="1" allowOverlap="1" wp14:anchorId="67E89487" wp14:editId="659F2B5B">
+          <wp:anchor distT="0" distB="0" distL="114300" distR="114300" simplePos="0" relativeHeight="251658240" behindDoc="1" locked="0" layoutInCell="1" allowOverlap="1" wp14:anchorId="476AD4FE" wp14:editId="7AF67F86">
             <wp:simplePos x="0" y="0"/>
             <wp:positionH relativeFrom="column">
               <wp:posOffset>1620520</wp:posOffset>
@@ -5259,7 +5259,7 @@
         </w:rPr>
         <w:lastRenderedPageBreak/>
         <w:drawing>
-          <wp:inline distT="0" distB="0" distL="0" distR="0" wp14:anchorId="6096DEBA" wp14:editId="11C3D764">
+          <wp:inline distT="0" distB="0" distL="0" distR="0" wp14:anchorId="6879E006" wp14:editId="21A0440B">
             <wp:extent cx="3625850" cy="4495800"/>
             <wp:effectExtent l="0" t="0" r="0" b="0"/>
             <wp:docPr id="1" name="图片 2"/>
@@ -5485,7 +5485,7 @@
         </w:rPr>
         <w:lastRenderedPageBreak/>
         <w:drawing>
-          <wp:inline distT="0" distB="0" distL="0" distR="0" wp14:anchorId="16EB5DB0" wp14:editId="05F1367C">
+          <wp:inline distT="0" distB="0" distL="0" distR="0" wp14:anchorId="26943886" wp14:editId="32311FDE">
             <wp:extent cx="3416300" cy="4375150"/>
             <wp:effectExtent l="0" t="0" r="0" b="0"/>
             <wp:docPr id="2" name="图片 1"/>
@@ -6414,7 +6414,7 @@
         </w:rPr>
         <w:lastRenderedPageBreak/>
         <w:drawing>
-          <wp:inline distT="0" distB="0" distL="0" distR="0" wp14:anchorId="5E75F3CA" wp14:editId="426DB623">
+          <wp:inline distT="0" distB="0" distL="0" distR="0" wp14:anchorId="1F492733" wp14:editId="44CAC695">
             <wp:extent cx="4527550" cy="4127500"/>
             <wp:effectExtent l="0" t="0" r="0" b="0"/>
             <wp:docPr id="3" name="图片 1"/>
@@ -8023,16 +8023,16 @@
       </w:pPr>
     </w:lvl>
   </w:abstractNum>
-  <w:num w:numId="1" w16cid:durableId="743336674">
+  <w:num w:numId="1" w16cid:durableId="2059086787">
     <w:abstractNumId w:val="0"/>
   </w:num>
-  <w:num w:numId="2" w16cid:durableId="883564634">
+  <w:num w:numId="2" w16cid:durableId="173082004">
     <w:abstractNumId w:val="3"/>
   </w:num>
-  <w:num w:numId="3" w16cid:durableId="1099369696">
+  <w:num w:numId="3" w16cid:durableId="690306343">
     <w:abstractNumId w:val="2"/>
   </w:num>
-  <w:num w:numId="4" w16cid:durableId="743454656">
+  <w:num w:numId="4" w16cid:durableId="842161392">
     <w:abstractNumId w:val="1"/>
   </w:num>
 </w:numbering>

</xml_diff>